<commit_message>
chore: set up frontend architecture and initial project structure
</commit_message>
<xml_diff>
--- a/MASTER.docx
+++ b/MASTER.docx
@@ -4663,7 +4663,7 @@
     <w:p>
       <w:r>
         <w:pict>
-          <v:rect id="_x0000_i1029" style="width:0;height:1.5pt" o:hralign="center" o:hrstd="t" o:hr="t" fillcolor="#a0a0a0" stroked="f"/>
+          <v:rect id="_x0000_i1027" style="width:0;height:1.5pt" o:hralign="center" o:hrstd="t" o:hr="t" fillcolor="#a0a0a0" stroked="f"/>
         </w:pict>
       </w:r>
     </w:p>
@@ -4720,7 +4720,7 @@
     <w:p>
       <w:r>
         <w:pict>
-          <v:rect id="_x0000_i1030" style="width:0;height:1.5pt" o:hralign="center" o:hrstd="t" o:hr="t" fillcolor="#a0a0a0" stroked="f"/>
+          <v:rect id="_x0000_i1028" style="width:0;height:1.5pt" o:hralign="center" o:hrstd="t" o:hr="t" fillcolor="#a0a0a0" stroked="f"/>
         </w:pict>
       </w:r>
     </w:p>
@@ -5867,7 +5867,6 @@
           <w:lang w:val="en-GB"/>
         </w:rPr>
       </w:pPr>
-      <w:bookmarkStart w:id="0" w:name="_GoBack"/>
       <w:r>
         <w:rPr>
           <w:sz w:val="16"/>
@@ -5895,7 +5894,6 @@
         <w:t>)</w:t>
       </w:r>
     </w:p>
-    <w:bookmarkEnd w:id="0"/>
     <w:p>
       <w:pPr>
         <w:ind w:left="708"/>
@@ -5968,6 +5966,1749 @@
         </w:rPr>
         <w:t>7. Tasks CRUD</w:t>
       </w:r>
+    </w:p>
+    <w:p>
+      <w:pPr>
+        <w:ind w:left="708"/>
+        <w:rPr>
+          <w:sz w:val="16"/>
+          <w:szCs w:val="16"/>
+          <w:lang w:val="en-GB"/>
+        </w:rPr>
+      </w:pPr>
+    </w:p>
+    <w:p>
+      <w:pPr>
+        <w:ind w:left="708"/>
+        <w:rPr>
+          <w:sz w:val="16"/>
+          <w:szCs w:val="16"/>
+          <w:lang w:val="en-GB"/>
+        </w:rPr>
+      </w:pPr>
+      <w:r>
+        <w:rPr>
+          <w:sz w:val="16"/>
+          <w:szCs w:val="16"/>
+          <w:lang w:val="en-GB"/>
+        </w:rPr>
+        <w:t xml:space="preserve">FRONT END </w:t>
+      </w:r>
+      <w:bookmarkStart w:id="0" w:name="_GoBack"/>
+      <w:bookmarkEnd w:id="0"/>
+    </w:p>
+    <w:p>
+      <w:pPr>
+        <w:ind w:left="708"/>
+        <w:rPr>
+          <w:sz w:val="16"/>
+          <w:szCs w:val="16"/>
+          <w:lang w:val="en-GB"/>
+        </w:rPr>
+      </w:pPr>
+    </w:p>
+    <w:p>
+      <w:pPr>
+        <w:ind w:left="708"/>
+        <w:rPr>
+          <w:sz w:val="16"/>
+          <w:szCs w:val="16"/>
+          <w:lang w:val="en-GB"/>
+        </w:rPr>
+      </w:pPr>
+    </w:p>
+    <w:p>
+      <w:pPr>
+        <w:ind w:left="708"/>
+        <w:rPr>
+          <w:sz w:val="16"/>
+          <w:szCs w:val="16"/>
+          <w:lang w:val="en-GB"/>
+        </w:rPr>
+      </w:pPr>
+    </w:p>
+    <w:p>
+      <w:pPr>
+        <w:ind w:left="708"/>
+        <w:rPr>
+          <w:sz w:val="16"/>
+          <w:szCs w:val="16"/>
+          <w:lang w:val="en-GB"/>
+        </w:rPr>
+      </w:pPr>
+      <w:proofErr w:type="spellStart"/>
+      <w:proofErr w:type="gramStart"/>
+      <w:r>
+        <w:rPr>
+          <w:sz w:val="16"/>
+          <w:szCs w:val="16"/>
+          <w:lang w:val="en-GB"/>
+        </w:rPr>
+        <w:t>src</w:t>
+      </w:r>
+      <w:proofErr w:type="spellEnd"/>
+      <w:proofErr w:type="gramEnd"/>
+      <w:r>
+        <w:rPr>
+          <w:sz w:val="16"/>
+          <w:szCs w:val="16"/>
+          <w:lang w:val="en-GB"/>
+        </w:rPr>
+        <w:t>/</w:t>
+      </w:r>
+    </w:p>
+    <w:p>
+      <w:pPr>
+        <w:ind w:left="708"/>
+        <w:rPr>
+          <w:sz w:val="16"/>
+          <w:szCs w:val="16"/>
+          <w:lang w:val="en-GB"/>
+        </w:rPr>
+      </w:pPr>
+      <w:r>
+        <w:rPr>
+          <w:sz w:val="16"/>
+          <w:szCs w:val="16"/>
+          <w:lang w:val="en-GB"/>
+        </w:rPr>
+        <w:t>│</w:t>
+      </w:r>
+    </w:p>
+    <w:p>
+      <w:pPr>
+        <w:ind w:left="708"/>
+        <w:rPr>
+          <w:sz w:val="16"/>
+          <w:szCs w:val="16"/>
+          <w:lang w:val="en-GB"/>
+        </w:rPr>
+      </w:pPr>
+      <w:r>
+        <w:rPr>
+          <w:rFonts w:ascii="Arial" w:hAnsi="Arial" w:cs="Arial"/>
+          <w:sz w:val="16"/>
+          <w:szCs w:val="16"/>
+          <w:lang w:val="en-GB"/>
+        </w:rPr>
+        <w:t>├</w:t>
+      </w:r>
+      <w:r>
+        <w:rPr>
+          <w:rFonts w:ascii="Calibri" w:hAnsi="Calibri" w:cs="Calibri"/>
+          <w:sz w:val="16"/>
+          <w:szCs w:val="16"/>
+          <w:lang w:val="en-GB"/>
+        </w:rPr>
+        <w:t>──</w:t>
+      </w:r>
+      <w:r>
+        <w:rPr>
+          <w:sz w:val="16"/>
+          <w:szCs w:val="16"/>
+          <w:lang w:val="en-GB"/>
+        </w:rPr>
+        <w:t xml:space="preserve"> </w:t>
+      </w:r>
+      <w:proofErr w:type="spellStart"/>
+      <w:proofErr w:type="gramStart"/>
+      <w:r>
+        <w:rPr>
+          <w:sz w:val="16"/>
+          <w:szCs w:val="16"/>
+          <w:lang w:val="en-GB"/>
+        </w:rPr>
+        <w:t>api</w:t>
+      </w:r>
+      <w:proofErr w:type="spellEnd"/>
+      <w:proofErr w:type="gramEnd"/>
+      <w:r>
+        <w:rPr>
+          <w:sz w:val="16"/>
+          <w:szCs w:val="16"/>
+          <w:lang w:val="en-GB"/>
+        </w:rPr>
+        <w:t>/</w:t>
+      </w:r>
+    </w:p>
+    <w:p>
+      <w:pPr>
+        <w:ind w:left="708"/>
+        <w:rPr>
+          <w:sz w:val="16"/>
+          <w:szCs w:val="16"/>
+          <w:lang w:val="en-GB"/>
+        </w:rPr>
+      </w:pPr>
+      <w:r>
+        <w:rPr>
+          <w:sz w:val="16"/>
+          <w:szCs w:val="16"/>
+          <w:lang w:val="en-GB"/>
+        </w:rPr>
+        <w:t xml:space="preserve">│   </w:t>
+      </w:r>
+      <w:r>
+        <w:rPr>
+          <w:rFonts w:ascii="Arial" w:hAnsi="Arial" w:cs="Arial"/>
+          <w:sz w:val="16"/>
+          <w:szCs w:val="16"/>
+          <w:lang w:val="en-GB"/>
+        </w:rPr>
+        <w:t>├</w:t>
+      </w:r>
+      <w:r>
+        <w:rPr>
+          <w:rFonts w:ascii="Calibri" w:hAnsi="Calibri" w:cs="Calibri"/>
+          <w:sz w:val="16"/>
+          <w:szCs w:val="16"/>
+          <w:lang w:val="en-GB"/>
+        </w:rPr>
+        <w:t>──</w:t>
+      </w:r>
+      <w:r>
+        <w:rPr>
+          <w:sz w:val="16"/>
+          <w:szCs w:val="16"/>
+          <w:lang w:val="en-GB"/>
+        </w:rPr>
+        <w:t xml:space="preserve"> axios.js</w:t>
+      </w:r>
+    </w:p>
+    <w:p>
+      <w:pPr>
+        <w:ind w:left="708"/>
+        <w:rPr>
+          <w:sz w:val="16"/>
+          <w:szCs w:val="16"/>
+          <w:lang w:val="en-GB"/>
+        </w:rPr>
+      </w:pPr>
+      <w:r>
+        <w:rPr>
+          <w:sz w:val="16"/>
+          <w:szCs w:val="16"/>
+          <w:lang w:val="en-GB"/>
+        </w:rPr>
+        <w:t xml:space="preserve">│   </w:t>
+      </w:r>
+      <w:r>
+        <w:rPr>
+          <w:rFonts w:ascii="Arial" w:hAnsi="Arial" w:cs="Arial"/>
+          <w:sz w:val="16"/>
+          <w:szCs w:val="16"/>
+          <w:lang w:val="en-GB"/>
+        </w:rPr>
+        <w:t>├</w:t>
+      </w:r>
+      <w:r>
+        <w:rPr>
+          <w:rFonts w:ascii="Calibri" w:hAnsi="Calibri" w:cs="Calibri"/>
+          <w:sz w:val="16"/>
+          <w:szCs w:val="16"/>
+          <w:lang w:val="en-GB"/>
+        </w:rPr>
+        <w:t>──</w:t>
+      </w:r>
+      <w:r>
+        <w:rPr>
+          <w:sz w:val="16"/>
+          <w:szCs w:val="16"/>
+          <w:lang w:val="en-GB"/>
+        </w:rPr>
+        <w:t xml:space="preserve"> authService.js</w:t>
+      </w:r>
+    </w:p>
+    <w:p>
+      <w:pPr>
+        <w:ind w:left="708"/>
+        <w:rPr>
+          <w:sz w:val="16"/>
+          <w:szCs w:val="16"/>
+          <w:lang w:val="en-GB"/>
+        </w:rPr>
+      </w:pPr>
+      <w:r>
+        <w:rPr>
+          <w:sz w:val="16"/>
+          <w:szCs w:val="16"/>
+          <w:lang w:val="en-GB"/>
+        </w:rPr>
+        <w:t>│   └── taskService.js</w:t>
+      </w:r>
+    </w:p>
+    <w:p>
+      <w:pPr>
+        <w:ind w:left="708"/>
+        <w:rPr>
+          <w:sz w:val="16"/>
+          <w:szCs w:val="16"/>
+          <w:lang w:val="en-GB"/>
+        </w:rPr>
+      </w:pPr>
+      <w:r>
+        <w:rPr>
+          <w:sz w:val="16"/>
+          <w:szCs w:val="16"/>
+          <w:lang w:val="en-GB"/>
+        </w:rPr>
+        <w:t>│</w:t>
+      </w:r>
+    </w:p>
+    <w:p>
+      <w:pPr>
+        <w:ind w:left="708"/>
+        <w:rPr>
+          <w:sz w:val="16"/>
+          <w:szCs w:val="16"/>
+          <w:lang w:val="en-GB"/>
+        </w:rPr>
+      </w:pPr>
+      <w:r>
+        <w:rPr>
+          <w:rFonts w:ascii="Arial" w:hAnsi="Arial" w:cs="Arial"/>
+          <w:sz w:val="16"/>
+          <w:szCs w:val="16"/>
+          <w:lang w:val="en-GB"/>
+        </w:rPr>
+        <w:t>├</w:t>
+      </w:r>
+      <w:r>
+        <w:rPr>
+          <w:rFonts w:ascii="Calibri" w:hAnsi="Calibri" w:cs="Calibri"/>
+          <w:sz w:val="16"/>
+          <w:szCs w:val="16"/>
+          <w:lang w:val="en-GB"/>
+        </w:rPr>
+        <w:t>──</w:t>
+      </w:r>
+      <w:r>
+        <w:rPr>
+          <w:sz w:val="16"/>
+          <w:szCs w:val="16"/>
+          <w:lang w:val="en-GB"/>
+        </w:rPr>
+        <w:t xml:space="preserve"> </w:t>
+      </w:r>
+      <w:proofErr w:type="gramStart"/>
+      <w:r>
+        <w:rPr>
+          <w:sz w:val="16"/>
+          <w:szCs w:val="16"/>
+          <w:lang w:val="en-GB"/>
+        </w:rPr>
+        <w:t>assets</w:t>
+      </w:r>
+      <w:proofErr w:type="gramEnd"/>
+      <w:r>
+        <w:rPr>
+          <w:sz w:val="16"/>
+          <w:szCs w:val="16"/>
+          <w:lang w:val="en-GB"/>
+        </w:rPr>
+        <w:t>/</w:t>
+      </w:r>
+    </w:p>
+    <w:p>
+      <w:pPr>
+        <w:ind w:left="708"/>
+        <w:rPr>
+          <w:sz w:val="16"/>
+          <w:szCs w:val="16"/>
+          <w:lang w:val="en-GB"/>
+        </w:rPr>
+      </w:pPr>
+      <w:r>
+        <w:rPr>
+          <w:sz w:val="16"/>
+          <w:szCs w:val="16"/>
+          <w:lang w:val="en-GB"/>
+        </w:rPr>
+        <w:t>│</w:t>
+      </w:r>
+    </w:p>
+    <w:p>
+      <w:pPr>
+        <w:ind w:left="708"/>
+        <w:rPr>
+          <w:sz w:val="16"/>
+          <w:szCs w:val="16"/>
+          <w:lang w:val="en-GB"/>
+        </w:rPr>
+      </w:pPr>
+      <w:r>
+        <w:rPr>
+          <w:rFonts w:ascii="Arial" w:hAnsi="Arial" w:cs="Arial"/>
+          <w:sz w:val="16"/>
+          <w:szCs w:val="16"/>
+          <w:lang w:val="en-GB"/>
+        </w:rPr>
+        <w:t>├</w:t>
+      </w:r>
+      <w:r>
+        <w:rPr>
+          <w:rFonts w:ascii="Calibri" w:hAnsi="Calibri" w:cs="Calibri"/>
+          <w:sz w:val="16"/>
+          <w:szCs w:val="16"/>
+          <w:lang w:val="en-GB"/>
+        </w:rPr>
+        <w:t>──</w:t>
+      </w:r>
+      <w:r>
+        <w:rPr>
+          <w:sz w:val="16"/>
+          <w:szCs w:val="16"/>
+          <w:lang w:val="en-GB"/>
+        </w:rPr>
+        <w:t xml:space="preserve"> </w:t>
+      </w:r>
+      <w:proofErr w:type="gramStart"/>
+      <w:r>
+        <w:rPr>
+          <w:sz w:val="16"/>
+          <w:szCs w:val="16"/>
+          <w:lang w:val="en-GB"/>
+        </w:rPr>
+        <w:t>components</w:t>
+      </w:r>
+      <w:proofErr w:type="gramEnd"/>
+      <w:r>
+        <w:rPr>
+          <w:sz w:val="16"/>
+          <w:szCs w:val="16"/>
+          <w:lang w:val="en-GB"/>
+        </w:rPr>
+        <w:t>/</w:t>
+      </w:r>
+    </w:p>
+    <w:p>
+      <w:pPr>
+        <w:ind w:left="708"/>
+        <w:rPr>
+          <w:sz w:val="16"/>
+          <w:szCs w:val="16"/>
+          <w:lang w:val="en-GB"/>
+        </w:rPr>
+      </w:pPr>
+      <w:r>
+        <w:rPr>
+          <w:sz w:val="16"/>
+          <w:szCs w:val="16"/>
+          <w:lang w:val="en-GB"/>
+        </w:rPr>
+        <w:t xml:space="preserve">│   </w:t>
+      </w:r>
+      <w:r>
+        <w:rPr>
+          <w:rFonts w:ascii="Arial" w:hAnsi="Arial" w:cs="Arial"/>
+          <w:sz w:val="16"/>
+          <w:szCs w:val="16"/>
+          <w:lang w:val="en-GB"/>
+        </w:rPr>
+        <w:t>├</w:t>
+      </w:r>
+      <w:r>
+        <w:rPr>
+          <w:rFonts w:ascii="Calibri" w:hAnsi="Calibri" w:cs="Calibri"/>
+          <w:sz w:val="16"/>
+          <w:szCs w:val="16"/>
+          <w:lang w:val="en-GB"/>
+        </w:rPr>
+        <w:t>──</w:t>
+      </w:r>
+      <w:r>
+        <w:rPr>
+          <w:sz w:val="16"/>
+          <w:szCs w:val="16"/>
+          <w:lang w:val="en-GB"/>
+        </w:rPr>
+        <w:t xml:space="preserve"> </w:t>
+      </w:r>
+      <w:proofErr w:type="spellStart"/>
+      <w:r>
+        <w:rPr>
+          <w:sz w:val="16"/>
+          <w:szCs w:val="16"/>
+          <w:lang w:val="en-GB"/>
+        </w:rPr>
+        <w:t>Button.jsx</w:t>
+      </w:r>
+      <w:proofErr w:type="spellEnd"/>
+    </w:p>
+    <w:p>
+      <w:pPr>
+        <w:ind w:left="708"/>
+        <w:rPr>
+          <w:sz w:val="16"/>
+          <w:szCs w:val="16"/>
+          <w:lang w:val="en-GB"/>
+        </w:rPr>
+      </w:pPr>
+      <w:r>
+        <w:rPr>
+          <w:sz w:val="16"/>
+          <w:szCs w:val="16"/>
+          <w:lang w:val="en-GB"/>
+        </w:rPr>
+        <w:t xml:space="preserve">│   </w:t>
+      </w:r>
+      <w:r>
+        <w:rPr>
+          <w:rFonts w:ascii="Arial" w:hAnsi="Arial" w:cs="Arial"/>
+          <w:sz w:val="16"/>
+          <w:szCs w:val="16"/>
+          <w:lang w:val="en-GB"/>
+        </w:rPr>
+        <w:t>├</w:t>
+      </w:r>
+      <w:r>
+        <w:rPr>
+          <w:rFonts w:ascii="Calibri" w:hAnsi="Calibri" w:cs="Calibri"/>
+          <w:sz w:val="16"/>
+          <w:szCs w:val="16"/>
+          <w:lang w:val="en-GB"/>
+        </w:rPr>
+        <w:t>──</w:t>
+      </w:r>
+      <w:r>
+        <w:rPr>
+          <w:sz w:val="16"/>
+          <w:szCs w:val="16"/>
+          <w:lang w:val="en-GB"/>
+        </w:rPr>
+        <w:t xml:space="preserve"> </w:t>
+      </w:r>
+      <w:proofErr w:type="spellStart"/>
+      <w:r>
+        <w:rPr>
+          <w:sz w:val="16"/>
+          <w:szCs w:val="16"/>
+          <w:lang w:val="en-GB"/>
+        </w:rPr>
+        <w:t>Card.jsx</w:t>
+      </w:r>
+      <w:proofErr w:type="spellEnd"/>
+    </w:p>
+    <w:p>
+      <w:pPr>
+        <w:ind w:left="708"/>
+        <w:rPr>
+          <w:sz w:val="16"/>
+          <w:szCs w:val="16"/>
+          <w:lang w:val="en-GB"/>
+        </w:rPr>
+      </w:pPr>
+      <w:r>
+        <w:rPr>
+          <w:sz w:val="16"/>
+          <w:szCs w:val="16"/>
+          <w:lang w:val="en-GB"/>
+        </w:rPr>
+        <w:t xml:space="preserve">│   </w:t>
+      </w:r>
+      <w:r>
+        <w:rPr>
+          <w:rFonts w:ascii="Arial" w:hAnsi="Arial" w:cs="Arial"/>
+          <w:sz w:val="16"/>
+          <w:szCs w:val="16"/>
+          <w:lang w:val="en-GB"/>
+        </w:rPr>
+        <w:t>├</w:t>
+      </w:r>
+      <w:r>
+        <w:rPr>
+          <w:rFonts w:ascii="Calibri" w:hAnsi="Calibri" w:cs="Calibri"/>
+          <w:sz w:val="16"/>
+          <w:szCs w:val="16"/>
+          <w:lang w:val="en-GB"/>
+        </w:rPr>
+        <w:t>──</w:t>
+      </w:r>
+      <w:r>
+        <w:rPr>
+          <w:sz w:val="16"/>
+          <w:szCs w:val="16"/>
+          <w:lang w:val="en-GB"/>
+        </w:rPr>
+        <w:t xml:space="preserve"> </w:t>
+      </w:r>
+      <w:proofErr w:type="spellStart"/>
+      <w:r>
+        <w:rPr>
+          <w:sz w:val="16"/>
+          <w:szCs w:val="16"/>
+          <w:lang w:val="en-GB"/>
+        </w:rPr>
+        <w:t>Input.jsx</w:t>
+      </w:r>
+      <w:proofErr w:type="spellEnd"/>
+    </w:p>
+    <w:p>
+      <w:pPr>
+        <w:ind w:left="708"/>
+        <w:rPr>
+          <w:sz w:val="16"/>
+          <w:szCs w:val="16"/>
+          <w:lang w:val="en-GB"/>
+        </w:rPr>
+      </w:pPr>
+      <w:r>
+        <w:rPr>
+          <w:sz w:val="16"/>
+          <w:szCs w:val="16"/>
+          <w:lang w:val="en-GB"/>
+        </w:rPr>
+        <w:t xml:space="preserve">│   </w:t>
+      </w:r>
+      <w:r>
+        <w:rPr>
+          <w:rFonts w:ascii="Arial" w:hAnsi="Arial" w:cs="Arial"/>
+          <w:sz w:val="16"/>
+          <w:szCs w:val="16"/>
+          <w:lang w:val="en-GB"/>
+        </w:rPr>
+        <w:t>├</w:t>
+      </w:r>
+      <w:r>
+        <w:rPr>
+          <w:rFonts w:ascii="Calibri" w:hAnsi="Calibri" w:cs="Calibri"/>
+          <w:sz w:val="16"/>
+          <w:szCs w:val="16"/>
+          <w:lang w:val="en-GB"/>
+        </w:rPr>
+        <w:t>──</w:t>
+      </w:r>
+      <w:r>
+        <w:rPr>
+          <w:sz w:val="16"/>
+          <w:szCs w:val="16"/>
+          <w:lang w:val="en-GB"/>
+        </w:rPr>
+        <w:t xml:space="preserve"> </w:t>
+      </w:r>
+      <w:proofErr w:type="spellStart"/>
+      <w:r>
+        <w:rPr>
+          <w:sz w:val="16"/>
+          <w:szCs w:val="16"/>
+          <w:lang w:val="en-GB"/>
+        </w:rPr>
+        <w:t>Navbar.jsx</w:t>
+      </w:r>
+      <w:proofErr w:type="spellEnd"/>
+    </w:p>
+    <w:p>
+      <w:pPr>
+        <w:ind w:left="708"/>
+        <w:rPr>
+          <w:sz w:val="16"/>
+          <w:szCs w:val="16"/>
+          <w:lang w:val="en-GB"/>
+        </w:rPr>
+      </w:pPr>
+      <w:r>
+        <w:rPr>
+          <w:sz w:val="16"/>
+          <w:szCs w:val="16"/>
+          <w:lang w:val="en-GB"/>
+        </w:rPr>
+        <w:t xml:space="preserve">│   </w:t>
+      </w:r>
+      <w:r>
+        <w:rPr>
+          <w:rFonts w:ascii="Arial" w:hAnsi="Arial" w:cs="Arial"/>
+          <w:sz w:val="16"/>
+          <w:szCs w:val="16"/>
+          <w:lang w:val="en-GB"/>
+        </w:rPr>
+        <w:t>├</w:t>
+      </w:r>
+      <w:r>
+        <w:rPr>
+          <w:rFonts w:ascii="Calibri" w:hAnsi="Calibri" w:cs="Calibri"/>
+          <w:sz w:val="16"/>
+          <w:szCs w:val="16"/>
+          <w:lang w:val="en-GB"/>
+        </w:rPr>
+        <w:t>──</w:t>
+      </w:r>
+      <w:r>
+        <w:rPr>
+          <w:sz w:val="16"/>
+          <w:szCs w:val="16"/>
+          <w:lang w:val="en-GB"/>
+        </w:rPr>
+        <w:t xml:space="preserve"> </w:t>
+      </w:r>
+      <w:proofErr w:type="spellStart"/>
+      <w:r>
+        <w:rPr>
+          <w:sz w:val="16"/>
+          <w:szCs w:val="16"/>
+          <w:lang w:val="en-GB"/>
+        </w:rPr>
+        <w:t>TaskCard.jsx</w:t>
+      </w:r>
+      <w:proofErr w:type="spellEnd"/>
+    </w:p>
+    <w:p>
+      <w:pPr>
+        <w:ind w:left="708"/>
+        <w:rPr>
+          <w:sz w:val="16"/>
+          <w:szCs w:val="16"/>
+          <w:lang w:val="en-GB"/>
+        </w:rPr>
+      </w:pPr>
+      <w:r>
+        <w:rPr>
+          <w:sz w:val="16"/>
+          <w:szCs w:val="16"/>
+          <w:lang w:val="en-GB"/>
+        </w:rPr>
+        <w:t xml:space="preserve">│   </w:t>
+      </w:r>
+      <w:r>
+        <w:rPr>
+          <w:rFonts w:ascii="Arial" w:hAnsi="Arial" w:cs="Arial"/>
+          <w:sz w:val="16"/>
+          <w:szCs w:val="16"/>
+          <w:lang w:val="en-GB"/>
+        </w:rPr>
+        <w:t>├</w:t>
+      </w:r>
+      <w:r>
+        <w:rPr>
+          <w:rFonts w:ascii="Calibri" w:hAnsi="Calibri" w:cs="Calibri"/>
+          <w:sz w:val="16"/>
+          <w:szCs w:val="16"/>
+          <w:lang w:val="en-GB"/>
+        </w:rPr>
+        <w:t>──</w:t>
+      </w:r>
+      <w:r>
+        <w:rPr>
+          <w:sz w:val="16"/>
+          <w:szCs w:val="16"/>
+          <w:lang w:val="en-GB"/>
+        </w:rPr>
+        <w:t xml:space="preserve"> </w:t>
+      </w:r>
+      <w:proofErr w:type="spellStart"/>
+      <w:r>
+        <w:rPr>
+          <w:sz w:val="16"/>
+          <w:szCs w:val="16"/>
+          <w:lang w:val="en-GB"/>
+        </w:rPr>
+        <w:t>TaskFilters.jsx</w:t>
+      </w:r>
+      <w:proofErr w:type="spellEnd"/>
+    </w:p>
+    <w:p>
+      <w:pPr>
+        <w:ind w:left="708"/>
+        <w:rPr>
+          <w:sz w:val="16"/>
+          <w:szCs w:val="16"/>
+          <w:lang w:val="en-GB"/>
+        </w:rPr>
+      </w:pPr>
+      <w:r>
+        <w:rPr>
+          <w:sz w:val="16"/>
+          <w:szCs w:val="16"/>
+          <w:lang w:val="en-GB"/>
+        </w:rPr>
+        <w:t xml:space="preserve">│   └── </w:t>
+      </w:r>
+      <w:proofErr w:type="spellStart"/>
+      <w:r>
+        <w:rPr>
+          <w:sz w:val="16"/>
+          <w:szCs w:val="16"/>
+          <w:lang w:val="en-GB"/>
+        </w:rPr>
+        <w:t>StatsCards.jsx</w:t>
+      </w:r>
+      <w:proofErr w:type="spellEnd"/>
+    </w:p>
+    <w:p>
+      <w:pPr>
+        <w:ind w:left="708"/>
+        <w:rPr>
+          <w:sz w:val="16"/>
+          <w:szCs w:val="16"/>
+          <w:lang w:val="en-GB"/>
+        </w:rPr>
+      </w:pPr>
+      <w:r>
+        <w:rPr>
+          <w:sz w:val="16"/>
+          <w:szCs w:val="16"/>
+          <w:lang w:val="en-GB"/>
+        </w:rPr>
+        <w:t>│</w:t>
+      </w:r>
+    </w:p>
+    <w:p>
+      <w:pPr>
+        <w:ind w:left="708"/>
+        <w:rPr>
+          <w:sz w:val="16"/>
+          <w:szCs w:val="16"/>
+          <w:lang w:val="en-GB"/>
+        </w:rPr>
+      </w:pPr>
+      <w:r>
+        <w:rPr>
+          <w:rFonts w:ascii="Arial" w:hAnsi="Arial" w:cs="Arial"/>
+          <w:sz w:val="16"/>
+          <w:szCs w:val="16"/>
+          <w:lang w:val="en-GB"/>
+        </w:rPr>
+        <w:t>├</w:t>
+      </w:r>
+      <w:r>
+        <w:rPr>
+          <w:rFonts w:ascii="Calibri" w:hAnsi="Calibri" w:cs="Calibri"/>
+          <w:sz w:val="16"/>
+          <w:szCs w:val="16"/>
+          <w:lang w:val="en-GB"/>
+        </w:rPr>
+        <w:t>──</w:t>
+      </w:r>
+      <w:r>
+        <w:rPr>
+          <w:sz w:val="16"/>
+          <w:szCs w:val="16"/>
+          <w:lang w:val="en-GB"/>
+        </w:rPr>
+        <w:t xml:space="preserve"> </w:t>
+      </w:r>
+      <w:proofErr w:type="gramStart"/>
+      <w:r>
+        <w:rPr>
+          <w:sz w:val="16"/>
+          <w:szCs w:val="16"/>
+          <w:lang w:val="en-GB"/>
+        </w:rPr>
+        <w:t>context</w:t>
+      </w:r>
+      <w:proofErr w:type="gramEnd"/>
+      <w:r>
+        <w:rPr>
+          <w:sz w:val="16"/>
+          <w:szCs w:val="16"/>
+          <w:lang w:val="en-GB"/>
+        </w:rPr>
+        <w:t>/</w:t>
+      </w:r>
+    </w:p>
+    <w:p>
+      <w:pPr>
+        <w:ind w:left="708"/>
+        <w:rPr>
+          <w:sz w:val="16"/>
+          <w:szCs w:val="16"/>
+          <w:lang w:val="en-GB"/>
+        </w:rPr>
+      </w:pPr>
+      <w:r>
+        <w:rPr>
+          <w:sz w:val="16"/>
+          <w:szCs w:val="16"/>
+          <w:lang w:val="en-GB"/>
+        </w:rPr>
+        <w:t xml:space="preserve">│   └── </w:t>
+      </w:r>
+      <w:proofErr w:type="spellStart"/>
+      <w:r>
+        <w:rPr>
+          <w:sz w:val="16"/>
+          <w:szCs w:val="16"/>
+          <w:lang w:val="en-GB"/>
+        </w:rPr>
+        <w:t>AuthContext.jsx</w:t>
+      </w:r>
+      <w:proofErr w:type="spellEnd"/>
+    </w:p>
+    <w:p>
+      <w:pPr>
+        <w:ind w:left="708"/>
+        <w:rPr>
+          <w:sz w:val="16"/>
+          <w:szCs w:val="16"/>
+          <w:lang w:val="en-GB"/>
+        </w:rPr>
+      </w:pPr>
+      <w:r>
+        <w:rPr>
+          <w:sz w:val="16"/>
+          <w:szCs w:val="16"/>
+          <w:lang w:val="en-GB"/>
+        </w:rPr>
+        <w:t>│</w:t>
+      </w:r>
+    </w:p>
+    <w:p>
+      <w:pPr>
+        <w:ind w:left="708"/>
+        <w:rPr>
+          <w:sz w:val="16"/>
+          <w:szCs w:val="16"/>
+          <w:lang w:val="en-GB"/>
+        </w:rPr>
+      </w:pPr>
+      <w:r>
+        <w:rPr>
+          <w:rFonts w:ascii="Arial" w:hAnsi="Arial" w:cs="Arial"/>
+          <w:sz w:val="16"/>
+          <w:szCs w:val="16"/>
+          <w:lang w:val="en-GB"/>
+        </w:rPr>
+        <w:t>├</w:t>
+      </w:r>
+      <w:r>
+        <w:rPr>
+          <w:rFonts w:ascii="Calibri" w:hAnsi="Calibri" w:cs="Calibri"/>
+          <w:sz w:val="16"/>
+          <w:szCs w:val="16"/>
+          <w:lang w:val="en-GB"/>
+        </w:rPr>
+        <w:t>──</w:t>
+      </w:r>
+      <w:r>
+        <w:rPr>
+          <w:sz w:val="16"/>
+          <w:szCs w:val="16"/>
+          <w:lang w:val="en-GB"/>
+        </w:rPr>
+        <w:t xml:space="preserve"> </w:t>
+      </w:r>
+      <w:proofErr w:type="gramStart"/>
+      <w:r>
+        <w:rPr>
+          <w:sz w:val="16"/>
+          <w:szCs w:val="16"/>
+          <w:lang w:val="en-GB"/>
+        </w:rPr>
+        <w:t>pages</w:t>
+      </w:r>
+      <w:proofErr w:type="gramEnd"/>
+      <w:r>
+        <w:rPr>
+          <w:sz w:val="16"/>
+          <w:szCs w:val="16"/>
+          <w:lang w:val="en-GB"/>
+        </w:rPr>
+        <w:t>/</w:t>
+      </w:r>
+    </w:p>
+    <w:p>
+      <w:pPr>
+        <w:ind w:left="708"/>
+        <w:rPr>
+          <w:sz w:val="16"/>
+          <w:szCs w:val="16"/>
+          <w:lang w:val="en-GB"/>
+        </w:rPr>
+      </w:pPr>
+      <w:r>
+        <w:rPr>
+          <w:sz w:val="16"/>
+          <w:szCs w:val="16"/>
+          <w:lang w:val="en-GB"/>
+        </w:rPr>
+        <w:t xml:space="preserve">│   </w:t>
+      </w:r>
+      <w:r>
+        <w:rPr>
+          <w:rFonts w:ascii="Arial" w:hAnsi="Arial" w:cs="Arial"/>
+          <w:sz w:val="16"/>
+          <w:szCs w:val="16"/>
+          <w:lang w:val="en-GB"/>
+        </w:rPr>
+        <w:t>├</w:t>
+      </w:r>
+      <w:r>
+        <w:rPr>
+          <w:rFonts w:ascii="Calibri" w:hAnsi="Calibri" w:cs="Calibri"/>
+          <w:sz w:val="16"/>
+          <w:szCs w:val="16"/>
+          <w:lang w:val="en-GB"/>
+        </w:rPr>
+        <w:t>──</w:t>
+      </w:r>
+      <w:r>
+        <w:rPr>
+          <w:sz w:val="16"/>
+          <w:szCs w:val="16"/>
+          <w:lang w:val="en-GB"/>
+        </w:rPr>
+        <w:t xml:space="preserve"> </w:t>
+      </w:r>
+      <w:proofErr w:type="spellStart"/>
+      <w:r>
+        <w:rPr>
+          <w:sz w:val="16"/>
+          <w:szCs w:val="16"/>
+          <w:lang w:val="en-GB"/>
+        </w:rPr>
+        <w:t>LoginPage.jsx</w:t>
+      </w:r>
+      <w:proofErr w:type="spellEnd"/>
+    </w:p>
+    <w:p>
+      <w:pPr>
+        <w:ind w:left="708"/>
+        <w:rPr>
+          <w:sz w:val="16"/>
+          <w:szCs w:val="16"/>
+          <w:lang w:val="en-GB"/>
+        </w:rPr>
+      </w:pPr>
+      <w:r>
+        <w:rPr>
+          <w:sz w:val="16"/>
+          <w:szCs w:val="16"/>
+          <w:lang w:val="en-GB"/>
+        </w:rPr>
+        <w:t xml:space="preserve">│   </w:t>
+      </w:r>
+      <w:r>
+        <w:rPr>
+          <w:rFonts w:ascii="Arial" w:hAnsi="Arial" w:cs="Arial"/>
+          <w:sz w:val="16"/>
+          <w:szCs w:val="16"/>
+          <w:lang w:val="en-GB"/>
+        </w:rPr>
+        <w:t>├</w:t>
+      </w:r>
+      <w:r>
+        <w:rPr>
+          <w:rFonts w:ascii="Calibri" w:hAnsi="Calibri" w:cs="Calibri"/>
+          <w:sz w:val="16"/>
+          <w:szCs w:val="16"/>
+          <w:lang w:val="en-GB"/>
+        </w:rPr>
+        <w:t>──</w:t>
+      </w:r>
+      <w:r>
+        <w:rPr>
+          <w:sz w:val="16"/>
+          <w:szCs w:val="16"/>
+          <w:lang w:val="en-GB"/>
+        </w:rPr>
+        <w:t xml:space="preserve"> </w:t>
+      </w:r>
+      <w:proofErr w:type="spellStart"/>
+      <w:r>
+        <w:rPr>
+          <w:sz w:val="16"/>
+          <w:szCs w:val="16"/>
+          <w:lang w:val="en-GB"/>
+        </w:rPr>
+        <w:t>RegisterPage.jsx</w:t>
+      </w:r>
+      <w:proofErr w:type="spellEnd"/>
+    </w:p>
+    <w:p>
+      <w:pPr>
+        <w:ind w:left="708"/>
+        <w:rPr>
+          <w:sz w:val="16"/>
+          <w:szCs w:val="16"/>
+          <w:lang w:val="en-GB"/>
+        </w:rPr>
+      </w:pPr>
+      <w:r>
+        <w:rPr>
+          <w:sz w:val="16"/>
+          <w:szCs w:val="16"/>
+          <w:lang w:val="en-GB"/>
+        </w:rPr>
+        <w:t xml:space="preserve">│   </w:t>
+      </w:r>
+      <w:r>
+        <w:rPr>
+          <w:rFonts w:ascii="Arial" w:hAnsi="Arial" w:cs="Arial"/>
+          <w:sz w:val="16"/>
+          <w:szCs w:val="16"/>
+          <w:lang w:val="en-GB"/>
+        </w:rPr>
+        <w:t>├</w:t>
+      </w:r>
+      <w:r>
+        <w:rPr>
+          <w:rFonts w:ascii="Calibri" w:hAnsi="Calibri" w:cs="Calibri"/>
+          <w:sz w:val="16"/>
+          <w:szCs w:val="16"/>
+          <w:lang w:val="en-GB"/>
+        </w:rPr>
+        <w:t>──</w:t>
+      </w:r>
+      <w:r>
+        <w:rPr>
+          <w:sz w:val="16"/>
+          <w:szCs w:val="16"/>
+          <w:lang w:val="en-GB"/>
+        </w:rPr>
+        <w:t xml:space="preserve"> </w:t>
+      </w:r>
+      <w:proofErr w:type="spellStart"/>
+      <w:r>
+        <w:rPr>
+          <w:sz w:val="16"/>
+          <w:szCs w:val="16"/>
+          <w:lang w:val="en-GB"/>
+        </w:rPr>
+        <w:t>DashboardPage.jsx</w:t>
+      </w:r>
+      <w:proofErr w:type="spellEnd"/>
+    </w:p>
+    <w:p>
+      <w:pPr>
+        <w:ind w:left="708"/>
+        <w:rPr>
+          <w:sz w:val="16"/>
+          <w:szCs w:val="16"/>
+          <w:lang w:val="en-GB"/>
+        </w:rPr>
+      </w:pPr>
+      <w:r>
+        <w:rPr>
+          <w:sz w:val="16"/>
+          <w:szCs w:val="16"/>
+          <w:lang w:val="en-GB"/>
+        </w:rPr>
+        <w:t xml:space="preserve">│   </w:t>
+      </w:r>
+      <w:r>
+        <w:rPr>
+          <w:rFonts w:ascii="Arial" w:hAnsi="Arial" w:cs="Arial"/>
+          <w:sz w:val="16"/>
+          <w:szCs w:val="16"/>
+          <w:lang w:val="en-GB"/>
+        </w:rPr>
+        <w:t>├</w:t>
+      </w:r>
+      <w:r>
+        <w:rPr>
+          <w:rFonts w:ascii="Calibri" w:hAnsi="Calibri" w:cs="Calibri"/>
+          <w:sz w:val="16"/>
+          <w:szCs w:val="16"/>
+          <w:lang w:val="en-GB"/>
+        </w:rPr>
+        <w:t>──</w:t>
+      </w:r>
+      <w:r>
+        <w:rPr>
+          <w:sz w:val="16"/>
+          <w:szCs w:val="16"/>
+          <w:lang w:val="en-GB"/>
+        </w:rPr>
+        <w:t xml:space="preserve"> </w:t>
+      </w:r>
+      <w:proofErr w:type="spellStart"/>
+      <w:r>
+        <w:rPr>
+          <w:sz w:val="16"/>
+          <w:szCs w:val="16"/>
+          <w:lang w:val="en-GB"/>
+        </w:rPr>
+        <w:t>TaskDetailsPage.jsx</w:t>
+      </w:r>
+      <w:proofErr w:type="spellEnd"/>
+    </w:p>
+    <w:p>
+      <w:pPr>
+        <w:ind w:left="708"/>
+        <w:rPr>
+          <w:sz w:val="16"/>
+          <w:szCs w:val="16"/>
+          <w:lang w:val="en-GB"/>
+        </w:rPr>
+      </w:pPr>
+      <w:r>
+        <w:rPr>
+          <w:sz w:val="16"/>
+          <w:szCs w:val="16"/>
+          <w:lang w:val="en-GB"/>
+        </w:rPr>
+        <w:t xml:space="preserve">│   </w:t>
+      </w:r>
+      <w:r>
+        <w:rPr>
+          <w:rFonts w:ascii="Arial" w:hAnsi="Arial" w:cs="Arial"/>
+          <w:sz w:val="16"/>
+          <w:szCs w:val="16"/>
+          <w:lang w:val="en-GB"/>
+        </w:rPr>
+        <w:t>├</w:t>
+      </w:r>
+      <w:r>
+        <w:rPr>
+          <w:rFonts w:ascii="Calibri" w:hAnsi="Calibri" w:cs="Calibri"/>
+          <w:sz w:val="16"/>
+          <w:szCs w:val="16"/>
+          <w:lang w:val="en-GB"/>
+        </w:rPr>
+        <w:t>──</w:t>
+      </w:r>
+      <w:r>
+        <w:rPr>
+          <w:sz w:val="16"/>
+          <w:szCs w:val="16"/>
+          <w:lang w:val="en-GB"/>
+        </w:rPr>
+        <w:t xml:space="preserve"> </w:t>
+      </w:r>
+      <w:proofErr w:type="spellStart"/>
+      <w:r>
+        <w:rPr>
+          <w:sz w:val="16"/>
+          <w:szCs w:val="16"/>
+          <w:lang w:val="en-GB"/>
+        </w:rPr>
+        <w:t>EditTaskPage.jsx</w:t>
+      </w:r>
+      <w:proofErr w:type="spellEnd"/>
+    </w:p>
+    <w:p>
+      <w:pPr>
+        <w:ind w:left="708"/>
+        <w:rPr>
+          <w:sz w:val="16"/>
+          <w:szCs w:val="16"/>
+          <w:lang w:val="en-GB"/>
+        </w:rPr>
+      </w:pPr>
+      <w:r>
+        <w:rPr>
+          <w:sz w:val="16"/>
+          <w:szCs w:val="16"/>
+          <w:lang w:val="en-GB"/>
+        </w:rPr>
+        <w:t xml:space="preserve">│   └── </w:t>
+      </w:r>
+      <w:proofErr w:type="spellStart"/>
+      <w:r>
+        <w:rPr>
+          <w:sz w:val="16"/>
+          <w:szCs w:val="16"/>
+          <w:lang w:val="en-GB"/>
+        </w:rPr>
+        <w:t>NotFoundPage.jsx</w:t>
+      </w:r>
+      <w:proofErr w:type="spellEnd"/>
+    </w:p>
+    <w:p>
+      <w:pPr>
+        <w:ind w:left="708"/>
+        <w:rPr>
+          <w:sz w:val="16"/>
+          <w:szCs w:val="16"/>
+          <w:lang w:val="en-GB"/>
+        </w:rPr>
+      </w:pPr>
+      <w:r>
+        <w:rPr>
+          <w:sz w:val="16"/>
+          <w:szCs w:val="16"/>
+          <w:lang w:val="en-GB"/>
+        </w:rPr>
+        <w:t>│</w:t>
+      </w:r>
+    </w:p>
+    <w:p>
+      <w:pPr>
+        <w:ind w:left="708"/>
+        <w:rPr>
+          <w:sz w:val="16"/>
+          <w:szCs w:val="16"/>
+          <w:lang w:val="en-GB"/>
+        </w:rPr>
+      </w:pPr>
+      <w:r>
+        <w:rPr>
+          <w:rFonts w:ascii="Arial" w:hAnsi="Arial" w:cs="Arial"/>
+          <w:sz w:val="16"/>
+          <w:szCs w:val="16"/>
+          <w:lang w:val="en-GB"/>
+        </w:rPr>
+        <w:t>├</w:t>
+      </w:r>
+      <w:r>
+        <w:rPr>
+          <w:rFonts w:ascii="Calibri" w:hAnsi="Calibri" w:cs="Calibri"/>
+          <w:sz w:val="16"/>
+          <w:szCs w:val="16"/>
+          <w:lang w:val="en-GB"/>
+        </w:rPr>
+        <w:t>──</w:t>
+      </w:r>
+      <w:r>
+        <w:rPr>
+          <w:sz w:val="16"/>
+          <w:szCs w:val="16"/>
+          <w:lang w:val="en-GB"/>
+        </w:rPr>
+        <w:t xml:space="preserve"> </w:t>
+      </w:r>
+      <w:proofErr w:type="gramStart"/>
+      <w:r>
+        <w:rPr>
+          <w:sz w:val="16"/>
+          <w:szCs w:val="16"/>
+          <w:lang w:val="en-GB"/>
+        </w:rPr>
+        <w:t>routes</w:t>
+      </w:r>
+      <w:proofErr w:type="gramEnd"/>
+      <w:r>
+        <w:rPr>
+          <w:sz w:val="16"/>
+          <w:szCs w:val="16"/>
+          <w:lang w:val="en-GB"/>
+        </w:rPr>
+        <w:t>/</w:t>
+      </w:r>
+    </w:p>
+    <w:p>
+      <w:pPr>
+        <w:ind w:left="708"/>
+        <w:rPr>
+          <w:sz w:val="16"/>
+          <w:szCs w:val="16"/>
+          <w:lang w:val="en-GB"/>
+        </w:rPr>
+      </w:pPr>
+      <w:r>
+        <w:rPr>
+          <w:sz w:val="16"/>
+          <w:szCs w:val="16"/>
+          <w:lang w:val="en-GB"/>
+        </w:rPr>
+        <w:t xml:space="preserve">│   └── </w:t>
+      </w:r>
+      <w:proofErr w:type="spellStart"/>
+      <w:r>
+        <w:rPr>
+          <w:sz w:val="16"/>
+          <w:szCs w:val="16"/>
+          <w:lang w:val="en-GB"/>
+        </w:rPr>
+        <w:t>ProtectedRoute.jsx</w:t>
+      </w:r>
+      <w:proofErr w:type="spellEnd"/>
+    </w:p>
+    <w:p>
+      <w:pPr>
+        <w:ind w:left="708"/>
+        <w:rPr>
+          <w:sz w:val="16"/>
+          <w:szCs w:val="16"/>
+          <w:lang w:val="en-GB"/>
+        </w:rPr>
+      </w:pPr>
+      <w:r>
+        <w:rPr>
+          <w:sz w:val="16"/>
+          <w:szCs w:val="16"/>
+          <w:lang w:val="en-GB"/>
+        </w:rPr>
+        <w:lastRenderedPageBreak/>
+        <w:t>│</w:t>
+      </w:r>
+    </w:p>
+    <w:p>
+      <w:pPr>
+        <w:ind w:left="708"/>
+        <w:rPr>
+          <w:sz w:val="16"/>
+          <w:szCs w:val="16"/>
+          <w:lang w:val="en-GB"/>
+        </w:rPr>
+      </w:pPr>
+      <w:r>
+        <w:rPr>
+          <w:rFonts w:ascii="Arial" w:hAnsi="Arial" w:cs="Arial"/>
+          <w:sz w:val="16"/>
+          <w:szCs w:val="16"/>
+          <w:lang w:val="en-GB"/>
+        </w:rPr>
+        <w:t>├</w:t>
+      </w:r>
+      <w:r>
+        <w:rPr>
+          <w:rFonts w:ascii="Calibri" w:hAnsi="Calibri" w:cs="Calibri"/>
+          <w:sz w:val="16"/>
+          <w:szCs w:val="16"/>
+          <w:lang w:val="en-GB"/>
+        </w:rPr>
+        <w:t>──</w:t>
+      </w:r>
+      <w:r>
+        <w:rPr>
+          <w:sz w:val="16"/>
+          <w:szCs w:val="16"/>
+          <w:lang w:val="en-GB"/>
+        </w:rPr>
+        <w:t xml:space="preserve"> </w:t>
+      </w:r>
+      <w:proofErr w:type="gramStart"/>
+      <w:r>
+        <w:rPr>
+          <w:sz w:val="16"/>
+          <w:szCs w:val="16"/>
+          <w:lang w:val="en-GB"/>
+        </w:rPr>
+        <w:t>styles</w:t>
+      </w:r>
+      <w:proofErr w:type="gramEnd"/>
+      <w:r>
+        <w:rPr>
+          <w:sz w:val="16"/>
+          <w:szCs w:val="16"/>
+          <w:lang w:val="en-GB"/>
+        </w:rPr>
+        <w:t>/</w:t>
+      </w:r>
+    </w:p>
+    <w:p>
+      <w:pPr>
+        <w:ind w:left="708"/>
+        <w:rPr>
+          <w:sz w:val="16"/>
+          <w:szCs w:val="16"/>
+          <w:lang w:val="en-GB"/>
+        </w:rPr>
+      </w:pPr>
+      <w:r>
+        <w:rPr>
+          <w:sz w:val="16"/>
+          <w:szCs w:val="16"/>
+          <w:lang w:val="en-GB"/>
+        </w:rPr>
+        <w:t xml:space="preserve">│   </w:t>
+      </w:r>
+      <w:r>
+        <w:rPr>
+          <w:rFonts w:ascii="Arial" w:hAnsi="Arial" w:cs="Arial"/>
+          <w:sz w:val="16"/>
+          <w:szCs w:val="16"/>
+          <w:lang w:val="en-GB"/>
+        </w:rPr>
+        <w:t>├</w:t>
+      </w:r>
+      <w:r>
+        <w:rPr>
+          <w:rFonts w:ascii="Calibri" w:hAnsi="Calibri" w:cs="Calibri"/>
+          <w:sz w:val="16"/>
+          <w:szCs w:val="16"/>
+          <w:lang w:val="en-GB"/>
+        </w:rPr>
+        <w:t>──</w:t>
+      </w:r>
+      <w:r>
+        <w:rPr>
+          <w:sz w:val="16"/>
+          <w:szCs w:val="16"/>
+          <w:lang w:val="en-GB"/>
+        </w:rPr>
+        <w:t xml:space="preserve"> globals.css</w:t>
+      </w:r>
+    </w:p>
+    <w:p>
+      <w:pPr>
+        <w:ind w:left="708"/>
+        <w:rPr>
+          <w:sz w:val="16"/>
+          <w:szCs w:val="16"/>
+          <w:lang w:val="en-GB"/>
+        </w:rPr>
+      </w:pPr>
+      <w:r>
+        <w:rPr>
+          <w:sz w:val="16"/>
+          <w:szCs w:val="16"/>
+          <w:lang w:val="en-GB"/>
+        </w:rPr>
+        <w:t xml:space="preserve">│   </w:t>
+      </w:r>
+      <w:r>
+        <w:rPr>
+          <w:rFonts w:ascii="Arial" w:hAnsi="Arial" w:cs="Arial"/>
+          <w:sz w:val="16"/>
+          <w:szCs w:val="16"/>
+          <w:lang w:val="en-GB"/>
+        </w:rPr>
+        <w:t>├</w:t>
+      </w:r>
+      <w:r>
+        <w:rPr>
+          <w:rFonts w:ascii="Calibri" w:hAnsi="Calibri" w:cs="Calibri"/>
+          <w:sz w:val="16"/>
+          <w:szCs w:val="16"/>
+          <w:lang w:val="en-GB"/>
+        </w:rPr>
+        <w:t>──</w:t>
+      </w:r>
+      <w:r>
+        <w:rPr>
+          <w:sz w:val="16"/>
+          <w:szCs w:val="16"/>
+          <w:lang w:val="en-GB"/>
+        </w:rPr>
+        <w:t xml:space="preserve"> auth.css</w:t>
+      </w:r>
+    </w:p>
+    <w:p>
+      <w:pPr>
+        <w:ind w:left="708"/>
+        <w:rPr>
+          <w:sz w:val="16"/>
+          <w:szCs w:val="16"/>
+          <w:lang w:val="en-GB"/>
+        </w:rPr>
+      </w:pPr>
+      <w:r>
+        <w:rPr>
+          <w:sz w:val="16"/>
+          <w:szCs w:val="16"/>
+          <w:lang w:val="en-GB"/>
+        </w:rPr>
+        <w:t xml:space="preserve">│   </w:t>
+      </w:r>
+      <w:r>
+        <w:rPr>
+          <w:rFonts w:ascii="Arial" w:hAnsi="Arial" w:cs="Arial"/>
+          <w:sz w:val="16"/>
+          <w:szCs w:val="16"/>
+          <w:lang w:val="en-GB"/>
+        </w:rPr>
+        <w:t>├</w:t>
+      </w:r>
+      <w:r>
+        <w:rPr>
+          <w:rFonts w:ascii="Calibri" w:hAnsi="Calibri" w:cs="Calibri"/>
+          <w:sz w:val="16"/>
+          <w:szCs w:val="16"/>
+          <w:lang w:val="en-GB"/>
+        </w:rPr>
+        <w:t>──</w:t>
+      </w:r>
+      <w:r>
+        <w:rPr>
+          <w:sz w:val="16"/>
+          <w:szCs w:val="16"/>
+          <w:lang w:val="en-GB"/>
+        </w:rPr>
+        <w:t xml:space="preserve"> dashboard.css</w:t>
+      </w:r>
+    </w:p>
+    <w:p>
+      <w:pPr>
+        <w:ind w:left="708"/>
+        <w:rPr>
+          <w:sz w:val="16"/>
+          <w:szCs w:val="16"/>
+          <w:lang w:val="en-GB"/>
+        </w:rPr>
+      </w:pPr>
+      <w:r>
+        <w:rPr>
+          <w:sz w:val="16"/>
+          <w:szCs w:val="16"/>
+          <w:lang w:val="en-GB"/>
+        </w:rPr>
+        <w:t>│   └── task.css</w:t>
+      </w:r>
+    </w:p>
+    <w:p>
+      <w:pPr>
+        <w:ind w:left="708"/>
+        <w:rPr>
+          <w:sz w:val="16"/>
+          <w:szCs w:val="16"/>
+          <w:lang w:val="en-GB"/>
+        </w:rPr>
+      </w:pPr>
+      <w:r>
+        <w:rPr>
+          <w:sz w:val="16"/>
+          <w:szCs w:val="16"/>
+          <w:lang w:val="en-GB"/>
+        </w:rPr>
+        <w:t>│</w:t>
+      </w:r>
+    </w:p>
+    <w:p>
+      <w:pPr>
+        <w:ind w:left="708"/>
+        <w:rPr>
+          <w:sz w:val="16"/>
+          <w:szCs w:val="16"/>
+          <w:lang w:val="en-GB"/>
+        </w:rPr>
+      </w:pPr>
+      <w:r>
+        <w:rPr>
+          <w:rFonts w:ascii="Arial" w:hAnsi="Arial" w:cs="Arial"/>
+          <w:sz w:val="16"/>
+          <w:szCs w:val="16"/>
+          <w:lang w:val="en-GB"/>
+        </w:rPr>
+        <w:t>├</w:t>
+      </w:r>
+      <w:r>
+        <w:rPr>
+          <w:rFonts w:ascii="Calibri" w:hAnsi="Calibri" w:cs="Calibri"/>
+          <w:sz w:val="16"/>
+          <w:szCs w:val="16"/>
+          <w:lang w:val="en-GB"/>
+        </w:rPr>
+        <w:t>──</w:t>
+      </w:r>
+      <w:r>
+        <w:rPr>
+          <w:sz w:val="16"/>
+          <w:szCs w:val="16"/>
+          <w:lang w:val="en-GB"/>
+        </w:rPr>
+        <w:t xml:space="preserve"> </w:t>
+      </w:r>
+      <w:proofErr w:type="spellStart"/>
+      <w:proofErr w:type="gramStart"/>
+      <w:r>
+        <w:rPr>
+          <w:sz w:val="16"/>
+          <w:szCs w:val="16"/>
+          <w:lang w:val="en-GB"/>
+        </w:rPr>
+        <w:t>utils</w:t>
+      </w:r>
+      <w:proofErr w:type="spellEnd"/>
+      <w:proofErr w:type="gramEnd"/>
+      <w:r>
+        <w:rPr>
+          <w:sz w:val="16"/>
+          <w:szCs w:val="16"/>
+          <w:lang w:val="en-GB"/>
+        </w:rPr>
+        <w:t>/</w:t>
+      </w:r>
+    </w:p>
+    <w:p>
+      <w:pPr>
+        <w:ind w:left="708"/>
+        <w:rPr>
+          <w:sz w:val="16"/>
+          <w:szCs w:val="16"/>
+          <w:lang w:val="en-GB"/>
+        </w:rPr>
+      </w:pPr>
+      <w:r>
+        <w:rPr>
+          <w:sz w:val="16"/>
+          <w:szCs w:val="16"/>
+          <w:lang w:val="en-GB"/>
+        </w:rPr>
+        <w:t>│   └── helpers.js</w:t>
+      </w:r>
+    </w:p>
+    <w:p>
+      <w:pPr>
+        <w:ind w:left="708"/>
+        <w:rPr>
+          <w:sz w:val="16"/>
+          <w:szCs w:val="16"/>
+          <w:lang w:val="en-GB"/>
+        </w:rPr>
+      </w:pPr>
+      <w:r>
+        <w:rPr>
+          <w:sz w:val="16"/>
+          <w:szCs w:val="16"/>
+          <w:lang w:val="en-GB"/>
+        </w:rPr>
+        <w:t>│</w:t>
+      </w:r>
+    </w:p>
+    <w:p>
+      <w:pPr>
+        <w:ind w:left="708"/>
+        <w:rPr>
+          <w:sz w:val="16"/>
+          <w:szCs w:val="16"/>
+          <w:lang w:val="en-GB"/>
+        </w:rPr>
+      </w:pPr>
+      <w:r>
+        <w:rPr>
+          <w:rFonts w:ascii="Arial" w:hAnsi="Arial" w:cs="Arial"/>
+          <w:sz w:val="16"/>
+          <w:szCs w:val="16"/>
+          <w:lang w:val="en-GB"/>
+        </w:rPr>
+        <w:t>├</w:t>
+      </w:r>
+      <w:r>
+        <w:rPr>
+          <w:rFonts w:ascii="Calibri" w:hAnsi="Calibri" w:cs="Calibri"/>
+          <w:sz w:val="16"/>
+          <w:szCs w:val="16"/>
+          <w:lang w:val="en-GB"/>
+        </w:rPr>
+        <w:t>──</w:t>
+      </w:r>
+      <w:r>
+        <w:rPr>
+          <w:sz w:val="16"/>
+          <w:szCs w:val="16"/>
+          <w:lang w:val="en-GB"/>
+        </w:rPr>
+        <w:t xml:space="preserve"> </w:t>
+      </w:r>
+      <w:proofErr w:type="spellStart"/>
+      <w:r>
+        <w:rPr>
+          <w:sz w:val="16"/>
+          <w:szCs w:val="16"/>
+          <w:lang w:val="en-GB"/>
+        </w:rPr>
+        <w:t>App.jsx</w:t>
+      </w:r>
+      <w:proofErr w:type="spellEnd"/>
+    </w:p>
+    <w:p>
+      <w:pPr>
+        <w:ind w:left="708"/>
+        <w:rPr>
+          <w:sz w:val="16"/>
+          <w:szCs w:val="16"/>
+          <w:lang w:val="en-GB"/>
+        </w:rPr>
+      </w:pPr>
+      <w:r>
+        <w:rPr>
+          <w:sz w:val="16"/>
+          <w:szCs w:val="16"/>
+          <w:lang w:val="en-GB"/>
+        </w:rPr>
+        <w:t xml:space="preserve">└── </w:t>
+      </w:r>
+      <w:proofErr w:type="spellStart"/>
+      <w:r>
+        <w:rPr>
+          <w:sz w:val="16"/>
+          <w:szCs w:val="16"/>
+          <w:lang w:val="en-GB"/>
+        </w:rPr>
+        <w:t>main.jsx</w:t>
+      </w:r>
+      <w:proofErr w:type="spellEnd"/>
     </w:p>
     <w:sectPr>
       <w:pgSz w:w="11906" w:h="16838"/>

</xml_diff>